<commit_message>
feat(briefs): add new template tags for all wizard data sections
Added 11 new tags to brief-template.docx: ministry, tenderNumber,
writtenDate, architectureSection, timelineSection, managementSection,
cloudServicesSection, goalsSection, expectedBenefits, targetAudience,
usersCount. Now all wizard steps map to the Word template.

Co-Authored-By: Claude Opus 4.6 <noreply@anthropic.com>
</commit_message>
<xml_diff>
--- a/digitek-platform/public/brief-template.docx
+++ b/digitek-platform/public/brief-template.docx
@@ -446,6 +446,30 @@
     </w:p>
     <w:p>
       <w:pPr>
+        <w:bidi/>
+      </w:pPr>
+      <w:r>
+        <w:t xml:space="preserve">{ministry}</w:t>
+      </w:r>
+    </w:p>
+    <w:p>
+      <w:pPr>
+        <w:bidi/>
+      </w:pPr>
+      <w:r>
+        <w:t xml:space="preserve">{tenderNumber}</w:t>
+      </w:r>
+    </w:p>
+    <w:p>
+      <w:pPr>
+        <w:bidi/>
+      </w:pPr>
+      <w:r>
+        <w:t xml:space="preserve">{writtenDate}</w:t>
+      </w:r>
+    </w:p>
+    <w:p>
+      <w:pPr>
         <w:bidi w:val="0"/>
         <w:spacing w:after="120" w:line="240" w:lineRule="atLeast"/>
         <w:rPr>
@@ -1080,6 +1104,38 @@
     </w:p>
     <w:p>
       <w:pPr>
+        <w:bidi/>
+      </w:pPr>
+      <w:r>
+        <w:t xml:space="preserve">{expectedBenefits}</w:t>
+      </w:r>
+    </w:p>
+    <w:p>
+      <w:pPr>
+        <w:bidi/>
+      </w:pPr>
+      <w:r>
+        <w:t xml:space="preserve">{targetAudience}</w:t>
+      </w:r>
+    </w:p>
+    <w:p>
+      <w:pPr>
+        <w:bidi/>
+      </w:pPr>
+      <w:r>
+        <w:t xml:space="preserve">{usersCount}</w:t>
+      </w:r>
+    </w:p>
+    <w:p>
+      <w:pPr>
+        <w:bidi/>
+      </w:pPr>
+      <w:r>
+        <w:t xml:space="preserve">{architectureSection}</w:t>
+      </w:r>
+    </w:p>
+    <w:p>
+      <w:pPr>
         <w:pStyle w:val="4f3"/>
         <w:tabs>
           <w:tab w:val="clear" w:pos="1371"/>
@@ -8651,6 +8707,14 @@
     </w:p>
     <w:p>
       <w:pPr>
+        <w:bidi/>
+      </w:pPr>
+      <w:r>
+        <w:t xml:space="preserve">{timelineSection}</w:t>
+      </w:r>
+    </w:p>
+    <w:p>
+      <w:pPr>
         <w:rPr>
           <w:rFonts w:cs="Calibri"/>
           <w:b/>
@@ -11446,6 +11510,14 @@
     </w:p>
     <w:p>
       <w:pPr>
+        <w:bidi/>
+      </w:pPr>
+      <w:r>
+        <w:t xml:space="preserve">{goalsSection}</w:t>
+      </w:r>
+    </w:p>
+    <w:p>
+      <w:pPr>
         <w:rPr>
           <w:rFonts w:cs="Calibri"/>
           <w:b/>
@@ -11667,6 +11739,14 @@
     </w:p>
     <w:p>
       <w:pPr>
+        <w:bidi/>
+      </w:pPr>
+      <w:r>
+        <w:t xml:space="preserve">{managementSection}</w:t>
+      </w:r>
+    </w:p>
+    <w:p>
+      <w:pPr>
         <w:ind w:left="720"/>
         <w:jc w:val="both"/>
         <w:rPr>
@@ -12525,6 +12605,14 @@
           <w:rtl/>
         </w:rPr>
       </w:pPr>
+    </w:p>
+    <w:p>
+      <w:pPr>
+        <w:bidi/>
+      </w:pPr>
+      <w:r>
+        <w:t xml:space="preserve">{cloudServicesSection}</w:t>
+      </w:r>
     </w:p>
     <w:p>
       <w:pPr>

</xml_diff>